<commit_message>
Corporate send-picker, approval semantics fix, calendar month-jump fix, Drive video rendering, Ali guide
</commit_message>
<xml_diff>
--- a/Agency Instructions.docx
+++ b/Agency Instructions.docx
@@ -252,7 +252,7 @@
           <w:szCs w:val="22"/>
           <w14:ligatures w14:val="standardContextual"/>
         </w:rPr>
-        <w:pict w14:anchorId="4908205E">
+        <w:pict w14:anchorId="6BD4DD85">
           <v:rect id="_x0000_i1029" alt="" style="width:468pt;height:.05pt;mso-width-percent:0;mso-height-percent:0;mso-width-percent:0;mso-height-percent:0" o:hralign="center" o:hrstd="t" o:hrnoshade="t" o:hr="t" fillcolor="#ccc" stroked="f"/>
         </w:pict>
       </w:r>
@@ -1119,7 +1119,7 @@
           <w:szCs w:val="22"/>
           <w14:ligatures w14:val="standardContextual"/>
         </w:rPr>
-        <w:pict w14:anchorId="77521729">
+        <w:pict w14:anchorId="13ADFCF3">
           <v:rect id="_x0000_i1028" alt="" style="width:468pt;height:.05pt;mso-width-percent:0;mso-height-percent:0;mso-width-percent:0;mso-height-percent:0" o:hralign="center" o:hrstd="t" o:hrnoshade="t" o:hr="t" fillcolor="#ccc" stroked="f"/>
         </w:pict>
       </w:r>
@@ -1223,6 +1223,27 @@
           <w:szCs w:val="22"/>
         </w:rPr>
         <w:t>Post</w:t>
+      </w:r>
+    </w:p>
+    <w:p>
+      <w:pPr>
+        <w:numPr>
+          <w:ilvl w:val="0"/>
+          <w:numId w:val="5"/>
+        </w:numPr>
+        <w:shd w:val="clear" w:color="auto" w:fill="FFFFFF"/>
+        <w:spacing w:line="240" w:lineRule="auto"/>
+        <w:rPr>
+          <w:color w:val="000000"/>
+          <w:szCs w:val="22"/>
+        </w:rPr>
+      </w:pPr>
+      <w:r>
+        <w:rPr>
+          <w:color w:val="000000"/>
+          <w:szCs w:val="22"/>
+        </w:rPr>
+        <w:t>Log into your Google Account with your FINN email (you won’t be able to access the agency dashboard if you’re not logged in</w:t>
       </w:r>
     </w:p>
     <w:p>
@@ -1541,28 +1562,28 @@
           <w:color w:val="000000"/>
           <w:szCs w:val="22"/>
         </w:rPr>
-        <w:t xml:space="preserve"> </w:t>
-      </w:r>
-      <w:r>
-        <w:rPr>
-          <w:color w:val="000000"/>
-          <w:szCs w:val="22"/>
-        </w:rPr>
-        <w:t>—</w:t>
-      </w:r>
-      <w:r>
-        <w:rPr>
-          <w:color w:val="000000"/>
-          <w:szCs w:val="22"/>
-        </w:rPr>
-        <w:t xml:space="preserve"> </w:t>
-      </w:r>
-      <w:r>
-        <w:rPr>
-          <w:color w:val="000000"/>
-          <w:szCs w:val="22"/>
-        </w:rPr>
-        <w:t>see</w:t>
+        <w:t>.</w:t>
+      </w:r>
+      <w:r>
+        <w:rPr>
+          <w:color w:val="000000"/>
+          <w:szCs w:val="22"/>
+        </w:rPr>
+        <w:t xml:space="preserve"> </w:t>
+      </w:r>
+      <w:r>
+        <w:rPr>
+          <w:color w:val="000000"/>
+          <w:szCs w:val="22"/>
+        </w:rPr>
+        <w:t>S</w:t>
+      </w:r>
+      <w:r>
+        <w:rPr>
+          <w:color w:val="000000"/>
+          <w:szCs w:val="22"/>
+        </w:rPr>
+        <w:t>ee</w:t>
       </w:r>
       <w:r>
         <w:rPr>
@@ -2928,6 +2949,7 @@
           <w:color w:val="000000"/>
           <w:szCs w:val="22"/>
         </w:rPr>
+        <w:lastRenderedPageBreak/>
         <w:t>For</w:t>
       </w:r>
       <w:r>
@@ -3286,7 +3308,6 @@
           <w:color w:val="000000"/>
           <w:szCs w:val="22"/>
         </w:rPr>
-        <w:lastRenderedPageBreak/>
         <w:t>Sending</w:t>
       </w:r>
       <w:r>
@@ -7287,7 +7308,7 @@
           <w:szCs w:val="22"/>
           <w14:ligatures w14:val="standardContextual"/>
         </w:rPr>
-        <w:pict w14:anchorId="19930192">
+        <w:pict w14:anchorId="390F2B7F">
           <v:rect id="_x0000_i1027" alt="" style="width:468pt;height:.05pt;mso-width-percent:0;mso-height-percent:0;mso-width-percent:0;mso-height-percent:0" o:hralign="center" o:hrstd="t" o:hrnoshade="t" o:hr="t" fillcolor="#ccc" stroked="f"/>
         </w:pict>
       </w:r>
@@ -7409,6 +7430,7 @@
                 <w:color w:val="000000"/>
                 <w:szCs w:val="22"/>
               </w:rPr>
+              <w:lastRenderedPageBreak/>
               <w:t>Color</w:t>
             </w:r>
           </w:p>
@@ -7925,7 +7947,6 @@
                 <w:color w:val="000000"/>
                 <w:szCs w:val="22"/>
               </w:rPr>
-              <w:lastRenderedPageBreak/>
               <w:t>Teal</w:t>
             </w:r>
           </w:p>
@@ -8723,7 +8744,7 @@
           <w:szCs w:val="22"/>
           <w14:ligatures w14:val="standardContextual"/>
         </w:rPr>
-        <w:pict w14:anchorId="4BD5AA1E">
+        <w:pict w14:anchorId="5EB6CA89">
           <v:rect id="_x0000_i1026" alt="" style="width:468pt;height:.05pt;mso-width-percent:0;mso-height-percent:0;mso-width-percent:0;mso-height-percent:0" o:hralign="center" o:hrstd="t" o:hrnoshade="t" o:hr="t" fillcolor="#ccc" stroked="f"/>
         </w:pict>
       </w:r>
@@ -9986,7 +10007,7 @@
           <w:szCs w:val="22"/>
           <w14:ligatures w14:val="standardContextual"/>
         </w:rPr>
-        <w:pict w14:anchorId="70594D6F">
+        <w:pict w14:anchorId="2C1D50F0">
           <v:rect id="_x0000_i1025" alt="" style="width:468pt;height:.05pt;mso-width-percent:0;mso-height-percent:0;mso-width-percent:0;mso-height-percent:0" o:hralign="center" o:hrstd="t" o:hrnoshade="t" o:hr="t" fillcolor="#ccc" stroked="f"/>
         </w:pict>
       </w:r>
@@ -10391,6 +10412,7 @@
                 <w:color w:val="000000"/>
                 <w:szCs w:val="22"/>
               </w:rPr>
+              <w:lastRenderedPageBreak/>
               <w:t>Symptom</w:t>
             </w:r>
           </w:p>
@@ -11337,7 +11359,6 @@
                 <w:color w:val="000000"/>
                 <w:szCs w:val="22"/>
               </w:rPr>
-              <w:lastRenderedPageBreak/>
               <w:t>No</w:t>
             </w:r>
             <w:r>

</xml_diff>